<commit_message>
Iguala el tamaño del logo del SEP al de la UCR y los alinea verticalmente
Co-Authored-By: Claude Fable 5 <noreply@anthropic.com>
</commit_message>
<xml_diff>
--- a/programa/pf0953-programacionr-g001-2026-ii.docx
+++ b/programa/pf0953-programacionr-g001-2026-ii.docx
@@ -5084,12 +5084,12 @@
               <wp:anchor behindDoc="0" distT="0" distB="0" distL="0" distR="0" simplePos="0" locked="0" layoutInCell="0" allowOverlap="1" relativeHeight="201">
                 <wp:simplePos x="0" y="0"/>
                 <wp:positionH relativeFrom="page">
-                  <wp:posOffset>5432400</wp:posOffset>
+                  <wp:posOffset>4512945</wp:posOffset>
                 </wp:positionH>
                 <wp:positionV relativeFrom="page">
-                  <wp:posOffset>400000</wp:posOffset>
+                  <wp:posOffset>217103</wp:posOffset>
                 </wp:positionV>
-                <wp:extent cx="1620000" cy="259773"/>
+                <wp:extent cx="1819275" cy="291727"/>
                 <wp:effectExtent l="0" t="0" r="0" b="0"/>
                 <wp:wrapNone/>
                 <wp:docPr id="901" name="LogoSEP1"/>
@@ -5109,7 +5109,7 @@
                       <pic:spPr>
                         <a:xfrm>
                           <a:off x="0" y="0"/>
-                          <a:ext cx="1620000" cy="259773"/>
+                          <a:ext cx="1819275" cy="291727"/>
                         </a:xfrm>
                         <a:prstGeom prst="rect">
                           <a:avLst/>
@@ -5453,12 +5453,12 @@
               <wp:anchor behindDoc="0" distT="0" distB="0" distL="0" distR="0" simplePos="0" locked="0" layoutInCell="0" allowOverlap="1" relativeHeight="202">
                 <wp:simplePos x="0" y="0"/>
                 <wp:positionH relativeFrom="page">
-                  <wp:posOffset>5432400</wp:posOffset>
+                  <wp:posOffset>4512945</wp:posOffset>
                 </wp:positionH>
                 <wp:positionV relativeFrom="page">
-                  <wp:posOffset>400000</wp:posOffset>
+                  <wp:posOffset>-20641</wp:posOffset>
                 </wp:positionV>
-                <wp:extent cx="1620000" cy="259773"/>
+                <wp:extent cx="1819275" cy="291727"/>
                 <wp:effectExtent l="0" t="0" r="0" b="0"/>
                 <wp:wrapNone/>
                 <wp:docPr id="902" name="LogoSEP2"/>
@@ -5478,7 +5478,7 @@
                       <pic:spPr>
                         <a:xfrm>
                           <a:off x="0" y="0"/>
-                          <a:ext cx="1620000" cy="259773"/>
+                          <a:ext cx="1819275" cy="291727"/>
                         </a:xfrm>
                         <a:prstGeom prst="rect">
                           <a:avLst/>

</xml_diff>

<commit_message>
Adapta el programa a la modalidad completamente virtual
Por indicación de la coordinación de la maestría, el curso pasa a ser
completamente virtual, con lecciones sincrónicas por videoconferencia
(sin mencionar una aplicación específica) en el horario del curso:

- Elimina los 5 exámenes cortos y redistribuye su 25 %: tareas 50 %
  (15 + 15 + 20) y proyecto final 50 % (aplicación 25 %, presentación
  oral sincrónica 10 %, documento 15 %).
- Mueve la entrega de la tarea 1 de la semana 4 a la semana 5.
- Elimina en la semana 1 la divulgación del reglamento contra el
  hostigamiento sexual, que no se solicita en posgrado.
- Quita la mención al trabajo en parejas; la decisión queda pospuesta.
- Ajusta postprocesar.py (3 tablas en lugar de 4), regenera DOCX y PDF
  y actualiza CLAUDE.md.

Co-Authored-By: Claude Fable 5 <noreply@anthropic.com>
</commit_message>
<xml_diff>
--- a/programa/pf0953-programacionr-g001-2026-ii.docx
+++ b/programa/pf0953-programacionr-g001-2026-ii.docx
@@ -33,13 +33,13 @@
         <w:jc w:val="center"/>
       </w:pPr>
       <w:r>
-        <w:t xml:space="preserve">Grupo 001, horario J 17-18-19 (17:00 a 19:50), aula 213, Créditos:</w:t>
-      </w:r>
-      <w:r>
-        <w:t xml:space="preserve"> </w:t>
-      </w:r>
-      <w:r>
-        <w:t xml:space="preserve">3</w:t>
+        <w:t xml:space="preserve">Grupo 001, horario J 17-18-19 (17:00 a 19:50), modalidad virtual,</w:t>
+      </w:r>
+      <w:r>
+        <w:t xml:space="preserve"> </w:t>
+      </w:r>
+      <w:r>
+        <w:t xml:space="preserve">Créditos: 3</w:t>
       </w:r>
     </w:p>
     <w:p>
@@ -212,37 +212,31 @@
         <w:t xml:space="preserve"> </w:t>
       </w:r>
       <w:r>
-        <w:t xml:space="preserve">del curso, cada estudiante, de manera individual o en parejas,</w:t>
-      </w:r>
-      <w:r>
-        <w:t xml:space="preserve"> </w:t>
-      </w:r>
-      <w:r>
-        <w:t xml:space="preserve">desarrolla un tema de su elección mediante tareas que funcionan como</w:t>
-      </w:r>
-      <w:r>
-        <w:t xml:space="preserve"> </w:t>
-      </w:r>
-      <w:r>
-        <w:t xml:space="preserve">aproximaciones incrementales al proyecto final. No se requiere</w:t>
-      </w:r>
-      <w:r>
-        <w:t xml:space="preserve"> </w:t>
-      </w:r>
-      <w:r>
-        <w:t xml:space="preserve">experiencia previa en programación de computadoras; es recomendable</w:t>
-      </w:r>
-      <w:r>
-        <w:t xml:space="preserve"> </w:t>
-      </w:r>
-      <w:r>
-        <w:t xml:space="preserve">contar con conocimientos básicos de datos geoespaciales y de sistemas de</w:t>
-      </w:r>
-      <w:r>
-        <w:t xml:space="preserve"> </w:t>
-      </w:r>
-      <w:r>
-        <w:t xml:space="preserve">información geográfica.</w:t>
+        <w:t xml:space="preserve">del curso, cada estudiante desarrolla un tema de su elección mediante</w:t>
+      </w:r>
+      <w:r>
+        <w:t xml:space="preserve"> </w:t>
+      </w:r>
+      <w:r>
+        <w:t xml:space="preserve">tareas que funcionan como aproximaciones incrementales al proyecto</w:t>
+      </w:r>
+      <w:r>
+        <w:t xml:space="preserve"> </w:t>
+      </w:r>
+      <w:r>
+        <w:t xml:space="preserve">final. No se requiere experiencia previa en programación de</w:t>
+      </w:r>
+      <w:r>
+        <w:t xml:space="preserve"> </w:t>
+      </w:r>
+      <w:r>
+        <w:t xml:space="preserve">computadoras; es recomendable contar con conocimientos básicos de datos</w:t>
+      </w:r>
+      <w:r>
+        <w:t xml:space="preserve"> </w:t>
+      </w:r>
+      <w:r>
+        <w:t xml:space="preserve">geoespaciales y de sistemas de información geográfica.</w:t>
       </w:r>
     </w:p>
     <w:p>
@@ -251,19 +245,25 @@
         <w:jc w:val="both"/>
       </w:pPr>
       <w:r>
-        <w:t xml:space="preserve">El curso es presencial y el entorno virtual se emplea como apoyo a</w:t>
-      </w:r>
-      <w:r>
-        <w:t xml:space="preserve"> </w:t>
-      </w:r>
-      <w:r>
-        <w:t xml:space="preserve">los aprendizajes. Los contenidos del curso y los recursos relacionados</w:t>
-      </w:r>
-      <w:r>
-        <w:t xml:space="preserve"> </w:t>
-      </w:r>
-      <w:r>
-        <w:t xml:space="preserve">se comparten en el sitio web</w:t>
+        <w:t xml:space="preserve">El curso es completamente virtual: las lecciones se imparten de</w:t>
+      </w:r>
+      <w:r>
+        <w:t xml:space="preserve"> </w:t>
+      </w:r>
+      <w:r>
+        <w:t xml:space="preserve">manera sincrónica por videoconferencia, en el horario del curso. Los</w:t>
+      </w:r>
+      <w:r>
+        <w:t xml:space="preserve"> </w:t>
+      </w:r>
+      <w:r>
+        <w:t xml:space="preserve">contenidos del curso y los recursos relacionados se comparten en el</w:t>
+      </w:r>
+      <w:r>
+        <w:t xml:space="preserve"> </w:t>
+      </w:r>
+      <w:r>
+        <w:t xml:space="preserve">sitio web</w:t>
       </w:r>
       <w:r>
         <w:t xml:space="preserve"> </w:t>
@@ -564,40 +564,13 @@
               <w:br/>
             </w:r>
             <w:r>
-              <w:t xml:space="preserve">Divulgación del</w:t>
+              <w:t xml:space="preserve">Introducción a la</w:t>
             </w:r>
             <w:r>
               <w:t xml:space="preserve"> </w:t>
             </w:r>
             <w:r>
-              <w:t xml:space="preserve">Reglamento de la Universidad de Costa Rica en contra del Hostigamiento</w:t>
-            </w:r>
-            <w:r>
-              <w:t xml:space="preserve"> </w:t>
-            </w:r>
-            <w:r>
-              <w:t xml:space="preserve">Sexual y promoción de un ambiente libre de</w:t>
-            </w:r>
-            <w:r>
-              <w:t xml:space="preserve"> </w:t>
-            </w:r>
-            <w:r>
-              <w:t xml:space="preserve">discriminación.</w:t>
-            </w:r>
-            <w:r>
-              <w:br/>
-            </w:r>
-            <w:r>
-              <w:br/>
-            </w:r>
-            <w:r>
-              <w:t xml:space="preserve">Introducción a la ciencia de</w:t>
-            </w:r>
-            <w:r>
-              <w:t xml:space="preserve"> </w:t>
-            </w:r>
-            <w:r>
-              <w:t xml:space="preserve">datos.</w:t>
+              <w:t xml:space="preserve">ciencia de datos.</w:t>
             </w:r>
             <w:r>
               <w:br/>
@@ -858,26 +831,7 @@
               <w:t xml:space="preserve"> </w:t>
             </w:r>
             <w:r>
-              <w:t xml:space="preserve">$: selección, ordenamiento, filtrado, agrupación,</w:t>
-            </w:r>
-            <w:r>
-              <w:t xml:space="preserve"> </w:t>
-            </w:r>
-            <w:r>
-              <w:t xml:space="preserve">sumarización.</w:t>
-            </w:r>
-            <w:r>
-              <w:br/>
-            </w:r>
-            <w:r>
-              <w:br/>
-            </w:r>
-            <w:r>
-              <w:rPr>
-                <w:b/>
-                <w:bCs/>
-              </w:rPr>
-              <w:t xml:space="preserve">EXAMEN CORTO 1</w:t>
+              <w:t xml:space="preserve">$: selección, ordenamiento, filtrado, agrupación, sumarización.</w:t>
             </w:r>
           </w:p>
         </w:tc>
@@ -956,33 +910,6 @@
             <w:r>
               <w:t xml:space="preserve">Funciones definidas por el usuario.</w:t>
             </w:r>
-            <w:r>
-              <w:br/>
-            </w:r>
-            <w:r>
-              <w:br/>
-            </w:r>
-            <w:r>
-              <w:rPr>
-                <w:b/>
-                <w:bCs/>
-              </w:rPr>
-              <w:t xml:space="preserve">ENTREGA DE TAREA</w:t>
-            </w:r>
-            <w:r>
-              <w:rPr>
-                <w:b/>
-                <w:bCs/>
-              </w:rPr>
-              <w:t xml:space="preserve"> </w:t>
-            </w:r>
-            <w:r>
-              <w:rPr>
-                <w:b/>
-                <w:bCs/>
-              </w:rPr>
-              <w:t xml:space="preserve">1</w:t>
-            </w:r>
           </w:p>
         </w:tc>
         <w:tc>
@@ -1064,7 +991,26 @@
               <w:t xml:space="preserve"> </w:t>
             </w:r>
             <w:r>
-              <w:t xml:space="preserve">inteligencia artificial para explicar y depurar código.</w:t>
+              <w:t xml:space="preserve">inteligencia artificial para explicar y depurar</w:t>
+            </w:r>
+            <w:r>
+              <w:t xml:space="preserve"> </w:t>
+            </w:r>
+            <w:r>
+              <w:t xml:space="preserve">código.</w:t>
+            </w:r>
+            <w:r>
+              <w:br/>
+            </w:r>
+            <w:r>
+              <w:br/>
+            </w:r>
+            <w:r>
+              <w:rPr>
+                <w:b/>
+                <w:bCs/>
+              </w:rPr>
+              <w:t xml:space="preserve">ENTREGA DE TAREA 1</w:t>
             </w:r>
           </w:p>
         </w:tc>
@@ -1182,26 +1128,7 @@
               <w:t xml:space="preserve"> </w:t>
             </w:r>
             <w:r>
-              <w:t xml:space="preserve">filtrado, agrupación, sumarización, unión de conjuntos de</w:t>
-            </w:r>
-            <w:r>
-              <w:t xml:space="preserve"> </w:t>
-            </w:r>
-            <w:r>
-              <w:t xml:space="preserve">datos).</w:t>
-            </w:r>
-            <w:r>
-              <w:br/>
-            </w:r>
-            <w:r>
-              <w:br/>
-            </w:r>
-            <w:r>
-              <w:rPr>
-                <w:b/>
-                <w:bCs/>
-              </w:rPr>
-              <w:t xml:space="preserve">EXAMEN CORTO 2</w:t>
+              <w:t xml:space="preserve">filtrado, agrupación, sumarización, unión de conjuntos de datos).</w:t>
             </w:r>
           </w:p>
         </w:tc>
@@ -1484,26 +1411,7 @@
               <w:t xml:space="preserve"> </w:t>
             </w:r>
             <w:r>
-              <w:t xml:space="preserve">paquete para manipulación y análisis de datos</w:t>
-            </w:r>
-            <w:r>
-              <w:t xml:space="preserve"> </w:t>
-            </w:r>
-            <w:r>
-              <w:t xml:space="preserve">vectoriales.</w:t>
-            </w:r>
-            <w:r>
-              <w:br/>
-            </w:r>
-            <w:r>
-              <w:br/>
-            </w:r>
-            <w:r>
-              <w:rPr>
-                <w:b/>
-                <w:bCs/>
-              </w:rPr>
-              <w:t xml:space="preserve">EXAMEN CORTO 3</w:t>
+              <w:t xml:space="preserve">paquete para manipulación y análisis de datos vectoriales.</w:t>
             </w:r>
           </w:p>
         </w:tc>
@@ -1811,19 +1719,6 @@
             <w:r>
               <w:t xml:space="preserve">tableros de control.</w:t>
             </w:r>
-            <w:r>
-              <w:br/>
-            </w:r>
-            <w:r>
-              <w:br/>
-            </w:r>
-            <w:r>
-              <w:rPr>
-                <w:b/>
-                <w:bCs/>
-              </w:rPr>
-              <w:t xml:space="preserve">EXAMEN CORTO 4</w:t>
-            </w:r>
           </w:p>
         </w:tc>
         <w:tc>
@@ -2075,7 +1970,7 @@
                 <w:b/>
                 <w:bCs/>
               </w:rPr>
-              <w:t xml:space="preserve">EXAMEN CORTO</w:t>
+              <w:t xml:space="preserve">PRESENTACIÓN</w:t>
             </w:r>
             <w:r>
               <w:rPr>
@@ -2089,34 +1984,7 @@
                 <w:b/>
                 <w:bCs/>
               </w:rPr>
-              <w:t xml:space="preserve">5</w:t>
-            </w:r>
-            <w:r>
-              <w:br/>
-            </w:r>
-            <w:r>
-              <w:br/>
-            </w:r>
-            <w:r>
-              <w:rPr>
-                <w:b/>
-                <w:bCs/>
-              </w:rPr>
-              <w:t xml:space="preserve">PRESENTACIÓN ORAL Y ENTREGA DE LA APLICACIÓN</w:t>
-            </w:r>
-            <w:r>
-              <w:rPr>
-                <w:b/>
-                <w:bCs/>
-              </w:rPr>
-              <w:t xml:space="preserve"> </w:t>
-            </w:r>
-            <w:r>
-              <w:rPr>
-                <w:b/>
-                <w:bCs/>
-              </w:rPr>
-              <w:t xml:space="preserve">DEL PROYECTO FINAL</w:t>
+              <w:t xml:space="preserve">ORAL Y ENTREGA DE LA APLICACIÓN DEL PROYECTO FINAL</w:t>
             </w:r>
           </w:p>
         </w:tc>
@@ -2187,49 +2055,55 @@
         <w:jc w:val="both"/>
       </w:pPr>
       <w:r>
-        <w:t xml:space="preserve">El curso se desarrolla mediante clases teórico-prácticas</w:t>
-      </w:r>
-      <w:r>
-        <w:t xml:space="preserve"> </w:t>
-      </w:r>
-      <w:r>
-        <w:t xml:space="preserve">presenciales. Los conceptos teóricos son explicados por el profesor</w:t>
-      </w:r>
-      <w:r>
-        <w:t xml:space="preserve"> </w:t>
-      </w:r>
-      <w:r>
-        <w:t xml:space="preserve">durante las sesiones de clase y también se abordan mediante lecturas</w:t>
-      </w:r>
-      <w:r>
-        <w:t xml:space="preserve"> </w:t>
-      </w:r>
-      <w:r>
-        <w:t xml:space="preserve">previamente asignadas. Las sesiones prácticas se destinan a la</w:t>
-      </w:r>
-      <w:r>
-        <w:t xml:space="preserve"> </w:t>
-      </w:r>
-      <w:r>
-        <w:t xml:space="preserve">realización de ejercicios de programación en los que el estudiantado</w:t>
-      </w:r>
-      <w:r>
-        <w:t xml:space="preserve"> </w:t>
-      </w:r>
-      <w:r>
-        <w:t xml:space="preserve">aplica los conocimientos aprendidos y las habilidades desarrolladas,</w:t>
-      </w:r>
-      <w:r>
-        <w:t xml:space="preserve"> </w:t>
-      </w:r>
-      <w:r>
-        <w:t xml:space="preserve">tanto en ejercicios cortos como en el desarrollo incremental del tema</w:t>
-      </w:r>
-      <w:r>
-        <w:t xml:space="preserve"> </w:t>
-      </w:r>
-      <w:r>
-        <w:t xml:space="preserve">elegido para las tareas y el proyecto final.</w:t>
+        <w:t xml:space="preserve">El curso se desarrolla mediante clases teórico-prácticas virtuales</w:t>
+      </w:r>
+      <w:r>
+        <w:t xml:space="preserve"> </w:t>
+      </w:r>
+      <w:r>
+        <w:t xml:space="preserve">sincrónicas, impartidas por videoconferencia en el horario del curso.</w:t>
+      </w:r>
+      <w:r>
+        <w:t xml:space="preserve"> </w:t>
+      </w:r>
+      <w:r>
+        <w:t xml:space="preserve">Los conceptos teóricos son explicados por el profesor durante las</w:t>
+      </w:r>
+      <w:r>
+        <w:t xml:space="preserve"> </w:t>
+      </w:r>
+      <w:r>
+        <w:t xml:space="preserve">sesiones de clase y también se abordan mediante lecturas previamente</w:t>
+      </w:r>
+      <w:r>
+        <w:t xml:space="preserve"> </w:t>
+      </w:r>
+      <w:r>
+        <w:t xml:space="preserve">asignadas. Las sesiones prácticas se destinan a la realización de</w:t>
+      </w:r>
+      <w:r>
+        <w:t xml:space="preserve"> </w:t>
+      </w:r>
+      <w:r>
+        <w:t xml:space="preserve">ejercicios de programación en los que el estudiantado aplica los</w:t>
+      </w:r>
+      <w:r>
+        <w:t xml:space="preserve"> </w:t>
+      </w:r>
+      <w:r>
+        <w:t xml:space="preserve">conocimientos aprendidos y las habilidades desarrolladas, tanto en</w:t>
+      </w:r>
+      <w:r>
+        <w:t xml:space="preserve"> </w:t>
+      </w:r>
+      <w:r>
+        <w:t xml:space="preserve">ejercicios cortos como en el desarrollo incremental del tema elegido</w:t>
+      </w:r>
+      <w:r>
+        <w:t xml:space="preserve"> </w:t>
+      </w:r>
+      <w:r>
+        <w:t xml:space="preserve">para las tareas y el proyecto final.</w:t>
       </w:r>
     </w:p>
     <w:p>
@@ -2319,67 +2193,49 @@
         <w:t xml:space="preserve"> </w:t>
       </w:r>
       <w:r>
-        <w:t xml:space="preserve">curso es presencial y utiliza un entorno virtual en la plataforma</w:t>
-      </w:r>
-      <w:r>
-        <w:t xml:space="preserve"> </w:t>
-      </w:r>
-      <w:r>
-        <w:t xml:space="preserve">Mediación Virtual como apoyo a los aprendizajes. En el entorno virtual</w:t>
-      </w:r>
-      <w:r>
-        <w:t xml:space="preserve"> </w:t>
-      </w:r>
-      <w:r>
-        <w:t xml:space="preserve">se comparten el programa del curso, los enlaces a los contenidos de las</w:t>
-      </w:r>
-      <w:r>
-        <w:t xml:space="preserve"> </w:t>
-      </w:r>
-      <w:r>
-        <w:t xml:space="preserve">lecciones y a los recursos didácticos; ahí también se realizan las</w:t>
-      </w:r>
-      <w:r>
-        <w:t xml:space="preserve"> </w:t>
-      </w:r>
-      <w:r>
-        <w:t xml:space="preserve">entregas de las tareas y del proyecto final, se comunican las</w:t>
-      </w:r>
-      <w:r>
-        <w:t xml:space="preserve"> </w:t>
-      </w:r>
-      <w:r>
-        <w:t xml:space="preserve">calificaciones mediante el libro de calificaciones y se envían mensajes</w:t>
-      </w:r>
-      <w:r>
-        <w:t xml:space="preserve"> </w:t>
-      </w:r>
-      <w:r>
-        <w:t xml:space="preserve">oficiales. No se programan lecciones virtuales sincrónicas ni</w:t>
-      </w:r>
-      <w:r>
-        <w:t xml:space="preserve"> </w:t>
-      </w:r>
-      <w:r>
-        <w:t xml:space="preserve">asincrónicas; en caso de fuerza mayor que impida una clase presencial,</w:t>
-      </w:r>
-      <w:r>
-        <w:t xml:space="preserve"> </w:t>
-      </w:r>
-      <w:r>
-        <w:t xml:space="preserve">esta podría impartirse de manera virtual, previo visto bueno de la</w:t>
-      </w:r>
-      <w:r>
-        <w:t xml:space="preserve"> </w:t>
-      </w:r>
-      <w:r>
-        <w:t xml:space="preserve">Dirección del Programa de Posgrado en Geografía y comunicación oportuna</w:t>
-      </w:r>
-      <w:r>
-        <w:t xml:space="preserve"> </w:t>
-      </w:r>
-      <w:r>
-        <w:t xml:space="preserve">al estudiantado.</w:t>
+        <w:t xml:space="preserve">curso es completamente virtual. Las lecciones se imparten de manera</w:t>
+      </w:r>
+      <w:r>
+        <w:t xml:space="preserve"> </w:t>
+      </w:r>
+      <w:r>
+        <w:t xml:space="preserve">sincrónica por videoconferencia, los jueves de 17:00 a 19:50; los</w:t>
+      </w:r>
+      <w:r>
+        <w:t xml:space="preserve"> </w:t>
+      </w:r>
+      <w:r>
+        <w:t xml:space="preserve">enlaces a las sesiones se publican en el entorno virtual del curso en la</w:t>
+      </w:r>
+      <w:r>
+        <w:t xml:space="preserve"> </w:t>
+      </w:r>
+      <w:r>
+        <w:t xml:space="preserve">plataforma Mediación Virtual. En el entorno virtual también se comparten</w:t>
+      </w:r>
+      <w:r>
+        <w:t xml:space="preserve"> </w:t>
+      </w:r>
+      <w:r>
+        <w:t xml:space="preserve">el programa del curso, los enlaces a los contenidos de las lecciones y a</w:t>
+      </w:r>
+      <w:r>
+        <w:t xml:space="preserve"> </w:t>
+      </w:r>
+      <w:r>
+        <w:t xml:space="preserve">los recursos didácticos; ahí se realizan las entregas de las tareas y</w:t>
+      </w:r>
+      <w:r>
+        <w:t xml:space="preserve"> </w:t>
+      </w:r>
+      <w:r>
+        <w:t xml:space="preserve">del proyecto final, se comunican las calificaciones mediante el libro de</w:t>
+      </w:r>
+      <w:r>
+        <w:t xml:space="preserve"> </w:t>
+      </w:r>
+      <w:r>
+        <w:t xml:space="preserve">calificaciones y se envían mensajes oficiales.</w:t>
       </w:r>
     </w:p>
     <w:p>
@@ -2452,25 +2308,25 @@
         <w:jc w:val="both"/>
       </w:pPr>
       <w:r>
-        <w:t xml:space="preserve">La atención de dudas y consultas se realiza en clase, en el horario</w:t>
-      </w:r>
-      <w:r>
-        <w:t xml:space="preserve"> </w:t>
-      </w:r>
-      <w:r>
-        <w:t xml:space="preserve">de atención al estudiantado (J 14-15-16), por medio del correo</w:t>
-      </w:r>
-      <w:r>
-        <w:t xml:space="preserve"> </w:t>
-      </w:r>
-      <w:r>
-        <w:t xml:space="preserve">electrónico institucional y mediante el sistema de mensajes de Mediación</w:t>
-      </w:r>
-      <w:r>
-        <w:t xml:space="preserve"> </w:t>
-      </w:r>
-      <w:r>
-        <w:t xml:space="preserve">Virtual.</w:t>
+        <w:t xml:space="preserve">La atención de dudas y consultas se realiza en las sesiones</w:t>
+      </w:r>
+      <w:r>
+        <w:t xml:space="preserve"> </w:t>
+      </w:r>
+      <w:r>
+        <w:t xml:space="preserve">sincrónicas, en el horario de atención al estudiantado (J 14-15-16, por</w:t>
+      </w:r>
+      <w:r>
+        <w:t xml:space="preserve"> </w:t>
+      </w:r>
+      <w:r>
+        <w:t xml:space="preserve">videoconferencia), por medio del correo electrónico institucional y</w:t>
+      </w:r>
+      <w:r>
+        <w:t xml:space="preserve"> </w:t>
+      </w:r>
+      <w:r>
+        <w:t xml:space="preserve">mediante el sistema de mensajes de Mediación Virtual.</w:t>
       </w:r>
     </w:p>
     <w:bookmarkEnd w:id="55"/>
@@ -2489,13 +2345,13 @@
         <w:jc w:val="both"/>
       </w:pPr>
       <w:r>
-        <w:t xml:space="preserve">La evaluación incluye tres componentes: exámenes cortos, tareas</w:t>
-      </w:r>
-      <w:r>
-        <w:t xml:space="preserve"> </w:t>
-      </w:r>
-      <w:r>
-        <w:t xml:space="preserve">programadas y proyecto final.</w:t>
+        <w:t xml:space="preserve">La evaluación incluye dos componentes: tareas programadas y proyecto</w:t>
+      </w:r>
+      <w:r>
+        <w:t xml:space="preserve"> </w:t>
+      </w:r>
+      <w:r>
+        <w:t xml:space="preserve">final.</w:t>
       </w:r>
     </w:p>
     <w:p>
@@ -2508,302 +2364,7 @@
           <w:b/>
           <w:bCs/>
         </w:rPr>
-        <w:t xml:space="preserve">a. Exámenes cortos (25 %)</w:t>
-      </w:r>
-      <w:r>
-        <w:t xml:space="preserve">. Consisten en pruebas</w:t>
-      </w:r>
-      <w:r>
-        <w:t xml:space="preserve"> </w:t>
-      </w:r>
-      <w:r>
-        <w:t xml:space="preserve">cortas individuales, realizadas presencialmente y sin asistencia de</w:t>
-      </w:r>
-      <w:r>
-        <w:t xml:space="preserve"> </w:t>
-      </w:r>
-      <w:r>
-        <w:t xml:space="preserve">herramientas de inteligencia artificial. Su propósito es evaluar la</w:t>
-      </w:r>
-      <w:r>
-        <w:t xml:space="preserve"> </w:t>
-      </w:r>
-      <w:r>
-        <w:t xml:space="preserve">comprensión de las lecturas y de los conceptos teóricos y prácticos</w:t>
-      </w:r>
-      <w:r>
-        <w:t xml:space="preserve"> </w:t>
-      </w:r>
-      <w:r>
-        <w:t xml:space="preserve">cubiertos en clase. Las semanas estimadas de realización y las secciones</w:t>
-      </w:r>
-      <w:r>
-        <w:t xml:space="preserve"> </w:t>
-      </w:r>
-      <w:r>
-        <w:t xml:space="preserve">del contenido del curso a evaluar en cada examen corto se presentan en</w:t>
-      </w:r>
-      <w:r>
-        <w:t xml:space="preserve"> </w:t>
-      </w:r>
-      <w:r>
-        <w:t xml:space="preserve">la siguiente tabla:</w:t>
-      </w:r>
-    </w:p>
-    <w:p/>
-    <w:tbl>
-      <w:tblPr>
-        <w:tblStyle w:val="Table"/>
-        <w:tblW w:type="auto" w:w="0"/>
-        <w:tblLook w:firstRow="1" w:lastRow="0" w:firstColumn="0" w:lastColumn="0" w:noHBand="0" w:noVBand="0" w:val="0020"/>
-      </w:tblPr>
-      <w:tblGrid>
-        <w:gridCol w:w="2375"/>
-        <w:gridCol w:w="2109"/>
-        <w:gridCol w:w="4361"/>
-      </w:tblGrid>
-      <w:tr>
-        <w:trPr>
-          <w:cantSplit/>
-          <w:tblHeader w:val="on"/>
-        </w:trPr>
-        <w:tc>
-          <w:tcPr/>
-          <w:p>
-            <w:pPr>
-              <w:pStyle w:val="Compact"/>
-            </w:pPr>
-            <w:r>
-              <w:t xml:space="preserve">Semana de realización</w:t>
-            </w:r>
-          </w:p>
-        </w:tc>
-        <w:tc>
-          <w:tcPr/>
-          <w:p>
-            <w:pPr>
-              <w:pStyle w:val="Compact"/>
-            </w:pPr>
-            <w:r>
-              <w:t xml:space="preserve">Secciones a evaluar</w:t>
-            </w:r>
-          </w:p>
-        </w:tc>
-        <w:tc>
-          <w:tcPr/>
-          <w:p>
-            <w:pPr>
-              <w:pStyle w:val="Compact"/>
-            </w:pPr>
-            <w:r>
-              <w:t xml:space="preserve">Porcentaje de la calificación final del curso</w:t>
-            </w:r>
-          </w:p>
-        </w:tc>
-      </w:tr>
-      <w:tr>
-        <w:trPr>
-          <w:cantSplit/>
-        </w:trPr>
-        <w:tc>
-          <w:tcPr/>
-          <w:p>
-            <w:pPr>
-              <w:pStyle w:val="Compact"/>
-            </w:pPr>
-            <w:r>
-              <w:t xml:space="preserve">3</w:t>
-            </w:r>
-          </w:p>
-        </w:tc>
-        <w:tc>
-          <w:tcPr/>
-          <w:p>
-            <w:pPr>
-              <w:pStyle w:val="Compact"/>
-            </w:pPr>
-            <w:r>
-              <w:t xml:space="preserve">I</w:t>
-            </w:r>
-          </w:p>
-        </w:tc>
-        <w:tc>
-          <w:tcPr/>
-          <w:p>
-            <w:pPr>
-              <w:pStyle w:val="Compact"/>
-            </w:pPr>
-            <w:r>
-              <w:t xml:space="preserve">5 %</w:t>
-            </w:r>
-          </w:p>
-        </w:tc>
-      </w:tr>
-      <w:tr>
-        <w:trPr>
-          <w:cantSplit/>
-        </w:trPr>
-        <w:tc>
-          <w:tcPr/>
-          <w:p>
-            <w:pPr>
-              <w:pStyle w:val="Compact"/>
-            </w:pPr>
-            <w:r>
-              <w:t xml:space="preserve">6</w:t>
-            </w:r>
-          </w:p>
-        </w:tc>
-        <w:tc>
-          <w:tcPr/>
-          <w:p>
-            <w:pPr>
-              <w:pStyle w:val="Compact"/>
-            </w:pPr>
-            <w:r>
-              <w:t xml:space="preserve">II</w:t>
-            </w:r>
-          </w:p>
-        </w:tc>
-        <w:tc>
-          <w:tcPr/>
-          <w:p>
-            <w:pPr>
-              <w:pStyle w:val="Compact"/>
-            </w:pPr>
-            <w:r>
-              <w:t xml:space="preserve">5 %</w:t>
-            </w:r>
-          </w:p>
-        </w:tc>
-      </w:tr>
-      <w:tr>
-        <w:trPr>
-          <w:cantSplit/>
-        </w:trPr>
-        <w:tc>
-          <w:tcPr/>
-          <w:p>
-            <w:pPr>
-              <w:pStyle w:val="Compact"/>
-            </w:pPr>
-            <w:r>
-              <w:t xml:space="preserve">9</w:t>
-            </w:r>
-          </w:p>
-        </w:tc>
-        <w:tc>
-          <w:tcPr/>
-          <w:p>
-            <w:pPr>
-              <w:pStyle w:val="Compact"/>
-            </w:pPr>
-            <w:r>
-              <w:t xml:space="preserve">III</w:t>
-            </w:r>
-          </w:p>
-        </w:tc>
-        <w:tc>
-          <w:tcPr/>
-          <w:p>
-            <w:pPr>
-              <w:pStyle w:val="Compact"/>
-            </w:pPr>
-            <w:r>
-              <w:t xml:space="preserve">5 %</w:t>
-            </w:r>
-          </w:p>
-        </w:tc>
-      </w:tr>
-      <w:tr>
-        <w:trPr>
-          <w:cantSplit/>
-        </w:trPr>
-        <w:tc>
-          <w:tcPr/>
-          <w:p>
-            <w:pPr>
-              <w:pStyle w:val="Compact"/>
-            </w:pPr>
-            <w:r>
-              <w:t xml:space="preserve">13</w:t>
-            </w:r>
-          </w:p>
-        </w:tc>
-        <w:tc>
-          <w:tcPr/>
-          <w:p>
-            <w:pPr>
-              <w:pStyle w:val="Compact"/>
-            </w:pPr>
-            <w:r>
-              <w:t xml:space="preserve">IV</w:t>
-            </w:r>
-          </w:p>
-        </w:tc>
-        <w:tc>
-          <w:tcPr/>
-          <w:p>
-            <w:pPr>
-              <w:pStyle w:val="Compact"/>
-            </w:pPr>
-            <w:r>
-              <w:t xml:space="preserve">5 %</w:t>
-            </w:r>
-          </w:p>
-        </w:tc>
-      </w:tr>
-      <w:tr>
-        <w:trPr>
-          <w:cantSplit/>
-        </w:trPr>
-        <w:tc>
-          <w:tcPr/>
-          <w:p>
-            <w:pPr>
-              <w:pStyle w:val="Compact"/>
-            </w:pPr>
-            <w:r>
-              <w:t xml:space="preserve">16</w:t>
-            </w:r>
-          </w:p>
-        </w:tc>
-        <w:tc>
-          <w:tcPr/>
-          <w:p>
-            <w:pPr>
-              <w:pStyle w:val="Compact"/>
-            </w:pPr>
-            <w:r>
-              <w:t xml:space="preserve">V</w:t>
-            </w:r>
-          </w:p>
-        </w:tc>
-        <w:tc>
-          <w:tcPr/>
-          <w:p>
-            <w:pPr>
-              <w:pStyle w:val="Compact"/>
-            </w:pPr>
-            <w:r>
-              <w:t xml:space="preserve">5 %</w:t>
-            </w:r>
-          </w:p>
-        </w:tc>
-      </w:tr>
-    </w:tbl>
-    <w:p/>
-    <w:p>
-      <w:pPr>
-        <w:pStyle w:val="TextBody"/>
-        <w:jc w:val="both"/>
-      </w:pPr>
-      <w:r>
-        <w:rPr>
-          <w:b/>
-          <w:bCs/>
-        </w:rPr>
-        <w:t xml:space="preserve">b. Tareas programadas (40 %)</w:t>
+        <w:t xml:space="preserve">a. Tareas programadas (50 %)</w:t>
       </w:r>
       <w:r>
         <w:t xml:space="preserve">. Consisten en</w:t>
@@ -2824,31 +2385,25 @@
         <w:t xml:space="preserve"> </w:t>
       </w:r>
       <w:r>
-        <w:t xml:space="preserve">estudiante, de manera individual o en parejas. Su propósito es que el</w:t>
-      </w:r>
-      <w:r>
-        <w:t xml:space="preserve"> </w:t>
-      </w:r>
-      <w:r>
-        <w:t xml:space="preserve">estudiantado construya de manera incremental los productos que integrará</w:t>
-      </w:r>
-      <w:r>
-        <w:t xml:space="preserve"> </w:t>
-      </w:r>
-      <w:r>
-        <w:t xml:space="preserve">en el proyecto final. Las semanas estimadas de entrega, los temas a</w:t>
-      </w:r>
-      <w:r>
-        <w:t xml:space="preserve"> </w:t>
-      </w:r>
-      <w:r>
-        <w:t xml:space="preserve">desarrollar y el valor de cada tarea se presentan en la siguiente</w:t>
-      </w:r>
-      <w:r>
-        <w:t xml:space="preserve"> </w:t>
-      </w:r>
-      <w:r>
-        <w:t xml:space="preserve">tabla:</w:t>
+        <w:t xml:space="preserve">estudiante. Su propósito es que el estudiantado construya de manera</w:t>
+      </w:r>
+      <w:r>
+        <w:t xml:space="preserve"> </w:t>
+      </w:r>
+      <w:r>
+        <w:t xml:space="preserve">incremental los productos que integrará en el proyecto final. Las</w:t>
+      </w:r>
+      <w:r>
+        <w:t xml:space="preserve"> </w:t>
+      </w:r>
+      <w:r>
+        <w:t xml:space="preserve">semanas estimadas de entrega, los temas a desarrollar y el valor de cada</w:t>
+      </w:r>
+      <w:r>
+        <w:t xml:space="preserve"> </w:t>
+      </w:r>
+      <w:r>
+        <w:t xml:space="preserve">tarea se presentan en la siguiente tabla:</w:t>
       </w:r>
     </w:p>
     <w:p/>
@@ -2913,7 +2468,7 @@
               <w:pStyle w:val="Compact"/>
             </w:pPr>
             <w:r>
-              <w:t xml:space="preserve">4</w:t>
+              <w:t xml:space="preserve">5</w:t>
             </w:r>
           </w:p>
         </w:tc>
@@ -2953,7 +2508,7 @@
               <w:pStyle w:val="Compact"/>
             </w:pPr>
             <w:r>
-              <w:t xml:space="preserve">10 %</w:t>
+              <w:t xml:space="preserve">15 %</w:t>
             </w:r>
           </w:p>
         </w:tc>
@@ -3053,7 +2608,7 @@
               <w:pStyle w:val="Compact"/>
             </w:pPr>
             <w:r>
-              <w:t xml:space="preserve">15 %</w:t>
+              <w:t xml:space="preserve">20 %</w:t>
             </w:r>
           </w:p>
         </w:tc>
@@ -3070,7 +2625,7 @@
           <w:b/>
           <w:bCs/>
         </w:rPr>
-        <w:t xml:space="preserve">c. Proyecto final (35 %)</w:t>
+        <w:t xml:space="preserve">b. Proyecto final (50 %)</w:t>
       </w:r>
       <w:r>
         <w:t xml:space="preserve">. Su objetivo es sintetizar</w:t>
@@ -3115,37 +2670,43 @@
         <w:t xml:space="preserve"> </w:t>
       </w:r>
       <w:r>
-        <w:t xml:space="preserve">utilizados y los principales hallazgos; y (3) una presentación oral</w:t>
-      </w:r>
-      <w:r>
-        <w:t xml:space="preserve"> </w:t>
-      </w:r>
-      <w:r>
-        <w:t xml:space="preserve">presencial de la aplicación y de los resultados. La aplicación se</w:t>
-      </w:r>
-      <w:r>
-        <w:t xml:space="preserve"> </w:t>
-      </w:r>
-      <w:r>
-        <w:t xml:space="preserve">entrega y se presenta oralmente en la semana 16, última semana de</w:t>
-      </w:r>
-      <w:r>
-        <w:t xml:space="preserve"> </w:t>
-      </w:r>
-      <w:r>
-        <w:t xml:space="preserve">clases; el documento computacional se entrega en la semana de exámenes</w:t>
-      </w:r>
-      <w:r>
-        <w:t xml:space="preserve"> </w:t>
-      </w:r>
-      <w:r>
-        <w:t xml:space="preserve">finales, como examen final en modalidad "para la casa". Los componentes</w:t>
-      </w:r>
-      <w:r>
-        <w:t xml:space="preserve"> </w:t>
-      </w:r>
-      <w:r>
-        <w:t xml:space="preserve">y su valor se presentan en la siguiente tabla:</w:t>
+        <w:t xml:space="preserve">utilizados y los principales hallazgos; y (3) una presentación oral de</w:t>
+      </w:r>
+      <w:r>
+        <w:t xml:space="preserve"> </w:t>
+      </w:r>
+      <w:r>
+        <w:t xml:space="preserve">la aplicación y de los resultados, realizada de manera sincrónica por</w:t>
+      </w:r>
+      <w:r>
+        <w:t xml:space="preserve"> </w:t>
+      </w:r>
+      <w:r>
+        <w:t xml:space="preserve">videoconferencia. La aplicación se entrega y se presenta oralmente en la</w:t>
+      </w:r>
+      <w:r>
+        <w:t xml:space="preserve"> </w:t>
+      </w:r>
+      <w:r>
+        <w:t xml:space="preserve">semana 16, última semana de clases; el documento computacional se</w:t>
+      </w:r>
+      <w:r>
+        <w:t xml:space="preserve"> </w:t>
+      </w:r>
+      <w:r>
+        <w:t xml:space="preserve">entrega en la semana de exámenes finales, como examen final en modalidad</w:t>
+      </w:r>
+      <w:r>
+        <w:t xml:space="preserve"> </w:t>
+      </w:r>
+      <w:r>
+        <w:t xml:space="preserve">"para la casa". Los componentes y su valor se presentan en la siguiente</w:t>
+      </w:r>
+      <w:r>
+        <w:t xml:space="preserve"> </w:t>
+      </w:r>
+      <w:r>
+        <w:t xml:space="preserve">tabla:</w:t>
       </w:r>
     </w:p>
     <w:p/>
@@ -3247,7 +2808,7 @@
               <w:pStyle w:val="Compact"/>
             </w:pPr>
             <w:r>
-              <w:t xml:space="preserve">20 %</w:t>
+              <w:t xml:space="preserve">25 %</w:t>
             </w:r>
           </w:p>
         </w:tc>
@@ -3274,7 +2835,13 @@
               <w:pStyle w:val="Compact"/>
             </w:pPr>
             <w:r>
-              <w:t xml:space="preserve">Presentación oral presencial del proyecto.</w:t>
+              <w:t xml:space="preserve">Presentación oral sincrónica del proyecto, por</w:t>
+            </w:r>
+            <w:r>
+              <w:t xml:space="preserve"> </w:t>
+            </w:r>
+            <w:r>
+              <w:t xml:space="preserve">videoconferencia.</w:t>
             </w:r>
           </w:p>
         </w:tc>
@@ -3285,7 +2852,7 @@
               <w:pStyle w:val="Compact"/>
             </w:pPr>
             <w:r>
-              <w:t xml:space="preserve">5 %</w:t>
+              <w:t xml:space="preserve">10 %</w:t>
             </w:r>
           </w:p>
         </w:tc>
@@ -3341,7 +2908,7 @@
               <w:pStyle w:val="Compact"/>
             </w:pPr>
             <w:r>
-              <w:t xml:space="preserve">10 %</w:t>
+              <w:t xml:space="preserve">15 %</w:t>
             </w:r>
           </w:p>
         </w:tc>
@@ -3354,49 +2921,43 @@
         <w:jc w:val="both"/>
       </w:pPr>
       <w:r>
-        <w:t xml:space="preserve">En todas las evaluaciones, excepto los exámenes cortos, se permite el</w:t>
-      </w:r>
-      <w:r>
-        <w:t xml:space="preserve"> </w:t>
-      </w:r>
-      <w:r>
-        <w:t xml:space="preserve">uso de herramientas de inteligencia artificial, siempre que este se</w:t>
-      </w:r>
-      <w:r>
-        <w:t xml:space="preserve"> </w:t>
-      </w:r>
-      <w:r>
-        <w:t xml:space="preserve">declare explícitamente y que la persona estudiante comprenda y sea capaz</w:t>
-      </w:r>
-      <w:r>
-        <w:t xml:space="preserve"> </w:t>
-      </w:r>
-      <w:r>
-        <w:t xml:space="preserve">de explicar el trabajo entregado. El uso no declarado de estas</w:t>
-      </w:r>
-      <w:r>
-        <w:t xml:space="preserve"> </w:t>
-      </w:r>
-      <w:r>
-        <w:t xml:space="preserve">herramientas, o la incapacidad de explicar el trabajo propio, se</w:t>
-      </w:r>
-      <w:r>
-        <w:t xml:space="preserve"> </w:t>
-      </w:r>
-      <w:r>
-        <w:t xml:space="preserve">considerará una falta a la honestidad académica, según lo establecido en</w:t>
-      </w:r>
-      <w:r>
-        <w:t xml:space="preserve"> </w:t>
-      </w:r>
-      <w:r>
-        <w:t xml:space="preserve">el Reglamento de Orden y Disciplina de los Estudiantes de la Universidad</w:t>
-      </w:r>
-      <w:r>
-        <w:t xml:space="preserve"> </w:t>
-      </w:r>
-      <w:r>
-        <w:t xml:space="preserve">de Costa Rica.</w:t>
+        <w:t xml:space="preserve">En todas las evaluaciones se permite el uso de herramientas de</w:t>
+      </w:r>
+      <w:r>
+        <w:t xml:space="preserve"> </w:t>
+      </w:r>
+      <w:r>
+        <w:t xml:space="preserve">inteligencia artificial, siempre que este se declare explícitamente y</w:t>
+      </w:r>
+      <w:r>
+        <w:t xml:space="preserve"> </w:t>
+      </w:r>
+      <w:r>
+        <w:t xml:space="preserve">que la persona estudiante comprenda y sea capaz de explicar el trabajo</w:t>
+      </w:r>
+      <w:r>
+        <w:t xml:space="preserve"> </w:t>
+      </w:r>
+      <w:r>
+        <w:t xml:space="preserve">entregado. El uso no declarado de estas herramientas, o la incapacidad</w:t>
+      </w:r>
+      <w:r>
+        <w:t xml:space="preserve"> </w:t>
+      </w:r>
+      <w:r>
+        <w:t xml:space="preserve">de explicar el trabajo propio, se considerará una falta a la honestidad</w:t>
+      </w:r>
+      <w:r>
+        <w:t xml:space="preserve"> </w:t>
+      </w:r>
+      <w:r>
+        <w:t xml:space="preserve">académica, según lo establecido en el Reglamento de Orden y Disciplina</w:t>
+      </w:r>
+      <w:r>
+        <w:t xml:space="preserve"> </w:t>
+      </w:r>
+      <w:r>
+        <w:t xml:space="preserve">de los Estudiantes de la Universidad de Costa Rica.</w:t>
       </w:r>
     </w:p>
     <w:bookmarkEnd w:id="56"/>

</xml_diff>

<commit_message>
Menciona la Maestría en GIRH en la adscripción del curso
Agrega a la descripción que el curso también se imparte en la Maestría
Académica en Gestión Integrada del Recurso Hídrico para Latinoamérica
y el Caribe, como en el programa de 2024. Actualiza en CLAUDE.md el
estado del programa: PR #1 mergeado y decisiones cerradas (adscripción,
3 créditos confirmados y Geocomputation with R 2.ª ed. 2025 verificado
con CRC Press).

Co-Authored-By: Claude Fable 5 <noreply@anthropic.com>
</commit_message>
<xml_diff>
--- a/programa/pf0953-programacionr-g001-2026-ii.docx
+++ b/programa/pf0953-programacionr-g001-2026-ii.docx
@@ -179,7 +179,19 @@
         <w:t xml:space="preserve"> </w:t>
       </w:r>
       <w:r>
-        <w:t xml:space="preserve">de Estudios de Posgrado (SEP) de la Universidad de Costa Rica.</w:t>
+        <w:t xml:space="preserve">de Estudios de Posgrado (SEP) de la Universidad de Costa Rica, así como</w:t>
+      </w:r>
+      <w:r>
+        <w:t xml:space="preserve"> </w:t>
+      </w:r>
+      <w:r>
+        <w:t xml:space="preserve">en la Maestría Académica en Gestión Integrada del Recurso Hídrico para</w:t>
+      </w:r>
+      <w:r>
+        <w:t xml:space="preserve"> </w:t>
+      </w:r>
+      <w:r>
+        <w:t xml:space="preserve">Latinoamérica y el Caribe.</w:t>
       </w:r>
     </w:p>
     <w:p>

</xml_diff>